<commit_message>
Fix heading formatting lost in PDF preview conversion
Headings (Professional Portfolio, Evidence Appendix, etc.) relied on the
docx 'Heading 1/2' paragraph styles for their navy-blue color and larger
size. The textutil docx->html conversion used for PDF previews only
honors direct run-level formatting and silently drops style-inherited
formatting, so headings were rendering as plain black bold text at body
size instead of the intended navy, larger heading style.

Applied the heading style's formatting directly to every heading run
(color 1F3864, bold, Arial, correct size) across all 34 TEMPLATE and
EXAMPLE docx files -- this fixes both the real .docx downloads (belt
and braces, in case a viewer has the same style-resolution issue) and
the generated PDF previews once regenerated.
</commit_message>
<xml_diff>
--- a/document-templates/business-owner/02_Professional_Portfolio_Director_EXAMPLE.docx
+++ b/document-templates/business-owner/02_Professional_Portfolio_Director_EXAMPLE.docx
@@ -11,6 +11,8 @@
           <w:rFonts w:ascii="Arial" w:cs="Arial" w:eastAsia="Arial" w:hAnsi="Arial"/>
           <w:b/>
           <w:bCs/>
+          <w:color w:val="1F3864"/>
+          <w:sz w:val="32"/>
         </w:rPr>
         <w:t xml:space="preserve">Professional Portfolio</w:t>
       </w:r>
@@ -43,6 +45,9 @@
       <w:r>
         <w:rPr>
           <w:rFonts w:ascii="Arial" w:cs="Arial" w:eastAsia="Arial" w:hAnsi="Arial"/>
+          <w:b/>
+          <w:color w:val="1F3864"/>
+          <w:sz w:val="26"/>
         </w:rPr>
         <w:t xml:space="preserve">About the Applicant</w:t>
       </w:r>
@@ -723,6 +728,9 @@
       <w:r>
         <w:rPr>
           <w:rFonts w:ascii="Arial" w:cs="Arial" w:eastAsia="Arial" w:hAnsi="Arial"/>
+          <w:b/>
+          <w:color w:val="1F3864"/>
+          <w:sz w:val="26"/>
         </w:rPr>
         <w:t xml:space="preserve">Additional Companies</w:t>
       </w:r>
@@ -1053,6 +1061,9 @@
       <w:r>
         <w:rPr>
           <w:rFonts w:ascii="Arial" w:cs="Arial" w:eastAsia="Arial" w:hAnsi="Arial"/>
+          <w:b/>
+          <w:color w:val="1F3864"/>
+          <w:sz w:val="26"/>
         </w:rPr>
         <w:t xml:space="preserve">Key Clients &amp; Contracts</w:t>
       </w:r>
@@ -1105,6 +1116,9 @@
       <w:r>
         <w:rPr>
           <w:rFonts w:ascii="Arial" w:cs="Arial" w:eastAsia="Arial" w:hAnsi="Arial"/>
+          <w:b/>
+          <w:color w:val="1F3864"/>
+          <w:sz w:val="26"/>
         </w:rPr>
         <w:t xml:space="preserve">Professional Background</w:t>
       </w:r>
@@ -1146,6 +1160,9 @@
       <w:r>
         <w:rPr>
           <w:rFonts w:ascii="Arial" w:cs="Arial" w:eastAsia="Arial" w:hAnsi="Arial"/>
+          <w:b/>
+          <w:color w:val="1F3864"/>
+          <w:sz w:val="26"/>
         </w:rPr>
         <w:t xml:space="preserve">Declaration</w:t>
       </w:r>
@@ -1239,6 +1256,8 @@
           <w:rFonts w:ascii="Arial" w:cs="Arial" w:eastAsia="Arial" w:hAnsi="Arial"/>
           <w:b/>
           <w:bCs/>
+          <w:color w:val="1F3864"/>
+          <w:sz w:val="32"/>
         </w:rPr>
         <w:t xml:space="preserve">Evidence Appendix</w:t>
       </w:r>

</xml_diff>